<commit_message>
feat: implement backend server and MQTT service for smart home integration
</commit_message>
<xml_diff>
--- a/SRS-V2.docx
+++ b/SRS-V2.docx
@@ -632,7 +632,16 @@
           <w:sz w:val="40"/>
           <w:szCs w:val="40"/>
         </w:rPr>
-        <w:t xml:space="preserve">Bài báo cáo 1: SRS </w:t>
+        <w:t xml:space="preserve">Bài báo cáo </w:t>
+      </w:r>
+      <w:r>
+        <w:rPr>
+          <w:b/>
+          <w:color w:val="000000" w:themeColor="text1"/>
+          <w:sz w:val="40"/>
+          <w:szCs w:val="40"/>
+        </w:rPr>
+        <w:t>Final</w:t>
       </w:r>
     </w:p>
     <w:p>
@@ -910,7 +919,7 @@
     <w:p>
       <w:pPr>
         <w:spacing w:line="276" w:lineRule="auto"/>
-        <w:ind w:right="849"/>
+        <w:ind w:right="849" w:firstLine="720"/>
         <w:jc w:val="center"/>
         <w:rPr>
           <w:b/>
@@ -30266,6 +30275,9 @@
     </w:p>
     <w:p>
       <w:r>
+        <w:rPr>
+          <w:noProof/>
+        </w:rPr>
         <w:drawing>
           <wp:inline distT="0" distB="0" distL="0" distR="0" wp14:anchorId="1363E469" wp14:editId="776B85F0">
             <wp:extent cx="5734050" cy="4218625"/>
@@ -30978,10 +30990,10 @@
           <w:color w:val="000000" w:themeColor="text1"/>
         </w:rPr>
         <w:drawing>
-          <wp:inline distT="0" distB="0" distL="0" distR="0" wp14:anchorId="7A57C5CC" wp14:editId="1D9DD5CB">
-            <wp:extent cx="5302250" cy="2511131"/>
-            <wp:effectExtent l="0" t="0" r="0" b="3810"/>
-            <wp:docPr id="663209875" name="Picture 1"/>
+          <wp:inline distT="0" distB="0" distL="0" distR="0" wp14:anchorId="0AD2F8DD" wp14:editId="697D3357">
+            <wp:extent cx="5731510" cy="2726690"/>
+            <wp:effectExtent l="0" t="0" r="2540" b="0"/>
+            <wp:docPr id="1280819035" name="Picture 1"/>
             <wp:cNvGraphicFramePr>
               <a:graphicFrameLocks xmlns:a="http://schemas.openxmlformats.org/drawingml/2006/main" noChangeAspect="1"/>
             </wp:cNvGraphicFramePr>
@@ -30989,7 +31001,7 @@
               <a:graphicData uri="http://schemas.openxmlformats.org/drawingml/2006/picture">
                 <pic:pic xmlns:pic="http://schemas.openxmlformats.org/drawingml/2006/picture">
                   <pic:nvPicPr>
-                    <pic:cNvPr id="663209875" name=""/>
+                    <pic:cNvPr id="1280819035" name=""/>
                     <pic:cNvPicPr/>
                   </pic:nvPicPr>
                   <pic:blipFill>
@@ -31001,7 +31013,7 @@
                   <pic:spPr>
                     <a:xfrm>
                       <a:off x="0" y="0"/>
-                      <a:ext cx="5308854" cy="2514258"/>
+                      <a:ext cx="5731510" cy="2726690"/>
                     </a:xfrm>
                     <a:prstGeom prst="rect">
                       <a:avLst/>
@@ -31219,7 +31231,6 @@
           <w:b/>
           <w:color w:val="000000" w:themeColor="text1"/>
         </w:rPr>
-        <w:lastRenderedPageBreak/>
         <w:t xml:space="preserve">Màn hình Lịch sử thiết bị (DeviceHistory): </w:t>
       </w:r>
       <w:r>

</xml_diff>

<commit_message>
docs: update system requirements specification document
</commit_message>
<xml_diff>
--- a/SRS-V2.docx
+++ b/SRS-V2.docx
@@ -30990,10 +30990,10 @@
           <w:color w:val="000000" w:themeColor="text1"/>
         </w:rPr>
         <w:drawing>
-          <wp:inline distT="0" distB="0" distL="0" distR="0" wp14:anchorId="0AD2F8DD" wp14:editId="697D3357">
-            <wp:extent cx="5731510" cy="2726690"/>
-            <wp:effectExtent l="0" t="0" r="2540" b="0"/>
-            <wp:docPr id="1280819035" name="Picture 1"/>
+          <wp:inline distT="0" distB="0" distL="0" distR="0" wp14:anchorId="7F286E19" wp14:editId="5E70BCB3">
+            <wp:extent cx="5731510" cy="2714625"/>
+            <wp:effectExtent l="0" t="0" r="2540" b="9525"/>
+            <wp:docPr id="110153666" name="Picture 1"/>
             <wp:cNvGraphicFramePr>
               <a:graphicFrameLocks xmlns:a="http://schemas.openxmlformats.org/drawingml/2006/main" noChangeAspect="1"/>
             </wp:cNvGraphicFramePr>
@@ -31001,7 +31001,7 @@
               <a:graphicData uri="http://schemas.openxmlformats.org/drawingml/2006/picture">
                 <pic:pic xmlns:pic="http://schemas.openxmlformats.org/drawingml/2006/picture">
                   <pic:nvPicPr>
-                    <pic:cNvPr id="1280819035" name=""/>
+                    <pic:cNvPr id="110153666" name=""/>
                     <pic:cNvPicPr/>
                   </pic:nvPicPr>
                   <pic:blipFill>
@@ -31013,7 +31013,7 @@
                   <pic:spPr>
                     <a:xfrm>
                       <a:off x="0" y="0"/>
-                      <a:ext cx="5731510" cy="2726690"/>
+                      <a:ext cx="5731510" cy="2714625"/>
                     </a:xfrm>
                     <a:prstGeom prst="rect">
                       <a:avLst/>
@@ -31250,14 +31250,13 @@
       </w:pPr>
       <w:r>
         <w:rPr>
-          <w:noProof/>
           <w:color w:val="000000" w:themeColor="text1"/>
         </w:rPr>
         <w:drawing>
-          <wp:inline distT="0" distB="0" distL="0" distR="0" wp14:anchorId="7BDDC8AF" wp14:editId="43B39445">
-            <wp:extent cx="5760085" cy="2725420"/>
-            <wp:effectExtent l="0" t="0" r="0" b="0"/>
-            <wp:docPr id="814010117" name="Picture 1"/>
+          <wp:inline distT="0" distB="0" distL="0" distR="0" wp14:anchorId="037B336C" wp14:editId="102B1428">
+            <wp:extent cx="5731510" cy="2726690"/>
+            <wp:effectExtent l="0" t="0" r="2540" b="0"/>
+            <wp:docPr id="1239835417" name="Picture 1"/>
             <wp:cNvGraphicFramePr>
               <a:graphicFrameLocks xmlns:a="http://schemas.openxmlformats.org/drawingml/2006/main" noChangeAspect="1"/>
             </wp:cNvGraphicFramePr>
@@ -31265,7 +31264,7 @@
               <a:graphicData uri="http://schemas.openxmlformats.org/drawingml/2006/picture">
                 <pic:pic xmlns:pic="http://schemas.openxmlformats.org/drawingml/2006/picture">
                   <pic:nvPicPr>
-                    <pic:cNvPr id="814010117" name=""/>
+                    <pic:cNvPr id="1239835417" name=""/>
                     <pic:cNvPicPr/>
                   </pic:nvPicPr>
                   <pic:blipFill>
@@ -31277,7 +31276,7 @@
                   <pic:spPr>
                     <a:xfrm>
                       <a:off x="0" y="0"/>
-                      <a:ext cx="5760085" cy="2725420"/>
+                      <a:ext cx="5731510" cy="2726690"/>
                     </a:xfrm>
                     <a:prstGeom prst="rect">
                       <a:avLst/>

</xml_diff>